<commit_message>
update testimony template to handle new complaint logic
</commit_message>
<xml_diff>
--- a/docassemble/MLHDivorceAndCustody/data/templates/testimony_script.docx
+++ b/docassemble/MLHDivorceAndCustody/data/templates/testimony_script.docx
@@ -138,6 +138,9 @@
       <w:r>
         <w:t xml:space="preserve"> if </w:t>
       </w:r>
+      <w:r>
+        <w:t>(</w:t>
+      </w:r>
       <w:proofErr w:type="spellStart"/>
       <w:r>
         <w:t>tool_ID</w:t>
@@ -152,7 +155,35 @@
       </w:r>
       <w:proofErr w:type="spellEnd"/>
       <w:r>
-        <w:t>” and not (</w:t>
+        <w:t>”</w:t>
+      </w:r>
+      <w:r>
+        <w:t xml:space="preserve"> or (</w:t>
+      </w:r>
+      <w:proofErr w:type="spellStart"/>
+      <w:r>
+        <w:t>tool_ID</w:t>
+      </w:r>
+      <w:proofErr w:type="spellEnd"/>
+      <w:r>
+        <w:t xml:space="preserve"> == “</w:t>
+      </w:r>
+      <w:proofErr w:type="spellStart"/>
+      <w:r>
+        <w:t>divorce_complaint</w:t>
+      </w:r>
+      <w:proofErr w:type="spellEnd"/>
+      <w:r>
+        <w:t>”</w:t>
+      </w:r>
+      <w:r>
+        <w:t xml:space="preserve"> </w:t>
+      </w:r>
+      <w:r>
+        <w:t xml:space="preserve">and returning_to_finalize)) </w:t>
+      </w:r>
+      <w:r>
+        <w:t>and not (</w:t>
       </w:r>
       <w:r>
         <w:t xml:space="preserve">party_lived_6_months_MI['user'] and </w:t>
@@ -582,6 +613,9 @@
       <w:r>
         <w:t>(</w:t>
       </w:r>
+      <w:r>
+        <w:t>(</w:t>
+      </w:r>
       <w:proofErr w:type="spellStart"/>
       <w:r>
         <w:t>tool_ID</w:t>
@@ -596,7 +630,29 @@
       </w:r>
       <w:proofErr w:type="spellEnd"/>
       <w:r>
-        <w:t xml:space="preserve">” and </w:t>
+        <w:t xml:space="preserve">” </w:t>
+      </w:r>
+      <w:r>
+        <w:t>or (</w:t>
+      </w:r>
+      <w:proofErr w:type="spellStart"/>
+      <w:r>
+        <w:t>tool_ID</w:t>
+      </w:r>
+      <w:proofErr w:type="spellEnd"/>
+      <w:r>
+        <w:t xml:space="preserve"> == “</w:t>
+      </w:r>
+      <w:proofErr w:type="spellStart"/>
+      <w:r>
+        <w:t>divorce_complaint</w:t>
+      </w:r>
+      <w:proofErr w:type="spellEnd"/>
+      <w:r>
+        <w:t xml:space="preserve">” and returning_to_finalize)) </w:t>
+      </w:r>
+      <w:r>
+        <w:t xml:space="preserve">and </w:t>
       </w:r>
       <w:r>
         <w:t xml:space="preserve">party_lived_6_months_MI['user'] and </w:t>
@@ -626,7 +682,25 @@
       </w:r>
       <w:proofErr w:type="spellEnd"/>
       <w:r>
-        <w:t xml:space="preserve">” and </w:t>
+        <w:t xml:space="preserve">” </w:t>
+      </w:r>
+      <w:r>
+        <w:t>and not returning</w:t>
+      </w:r>
+      <w:r>
+        <w:t>_</w:t>
+      </w:r>
+      <w:r>
+        <w:t>to</w:t>
+      </w:r>
+      <w:r>
+        <w:t>_</w:t>
+      </w:r>
+      <w:r>
+        <w:t xml:space="preserve">finalize </w:t>
+      </w:r>
+      <w:r>
+        <w:t xml:space="preserve">and </w:t>
       </w:r>
       <w:proofErr w:type="spellStart"/>
       <w:r>
@@ -659,6 +733,9 @@
       <w:r>
         <w:t xml:space="preserve"> (</w:t>
       </w:r>
+      <w:r>
+        <w:t>(</w:t>
+      </w:r>
       <w:proofErr w:type="spellStart"/>
       <w:r>
         <w:t>tool_ID</w:t>
@@ -673,7 +750,29 @@
       </w:r>
       <w:proofErr w:type="spellEnd"/>
       <w:r>
-        <w:t xml:space="preserve">” and </w:t>
+        <w:t xml:space="preserve">” </w:t>
+      </w:r>
+      <w:r>
+        <w:t>or (</w:t>
+      </w:r>
+      <w:proofErr w:type="spellStart"/>
+      <w:r>
+        <w:t>tool_ID</w:t>
+      </w:r>
+      <w:proofErr w:type="spellEnd"/>
+      <w:r>
+        <w:t xml:space="preserve"> == “</w:t>
+      </w:r>
+      <w:proofErr w:type="spellStart"/>
+      <w:r>
+        <w:t>divorce_complaint</w:t>
+      </w:r>
+      <w:proofErr w:type="spellEnd"/>
+      <w:r>
+        <w:t xml:space="preserve">” and returning_to_finalize)) </w:t>
+      </w:r>
+      <w:r>
+        <w:t xml:space="preserve">and </w:t>
       </w:r>
       <w:r>
         <w:t>party_lived_6_months_MI[</w:t>
@@ -694,6 +793,7 @@
       </w:r>
       <w:proofErr w:type="spellStart"/>
       <w:r>
+        <w:lastRenderedPageBreak/>
         <w:t>party_ten_days_in_county</w:t>
       </w:r>
       <w:proofErr w:type="spellEnd"/>
@@ -725,7 +825,13 @@
       </w:r>
       <w:proofErr w:type="spellEnd"/>
       <w:r>
-        <w:t>” and</w:t>
+        <w:t>”</w:t>
+      </w:r>
+      <w:r>
+        <w:t xml:space="preserve"> and not returning_to_finalize</w:t>
+      </w:r>
+      <w:r>
+        <w:t xml:space="preserve"> and</w:t>
       </w:r>
       <w:r>
         <w:t xml:space="preserve"> </w:t>
@@ -774,30 +880,6 @@
           <w:iCs/>
         </w:rPr>
         <w:t xml:space="preserve">“I” </w:t>
-      </w:r>
-      <w:r>
-        <w:rPr>
-          <w:b/>
-          <w:bCs/>
-          <w:i/>
-          <w:iCs/>
-        </w:rPr>
-        <w:lastRenderedPageBreak/>
-        <w:t>or</w:t>
-      </w:r>
-      <w:r>
-        <w:rPr>
-          <w:i/>
-          <w:iCs/>
-        </w:rPr>
-        <w:t xml:space="preserve"> “My spouse”</w:t>
-      </w:r>
-      <w:r>
-        <w:rPr>
-          <w:i/>
-          <w:iCs/>
-        </w:rPr>
-        <w:t xml:space="preserve"> </w:t>
       </w:r>
       <w:r>
         <w:rPr>
@@ -813,6 +895,29 @@
           <w:i/>
           <w:iCs/>
         </w:rPr>
+        <w:t xml:space="preserve"> “My spouse”</w:t>
+      </w:r>
+      <w:r>
+        <w:rPr>
+          <w:i/>
+          <w:iCs/>
+        </w:rPr>
+        <w:t xml:space="preserve"> </w:t>
+      </w:r>
+      <w:r>
+        <w:rPr>
+          <w:b/>
+          <w:bCs/>
+          <w:i/>
+          <w:iCs/>
+        </w:rPr>
+        <w:t>or</w:t>
+      </w:r>
+      <w:r>
+        <w:rPr>
+          <w:i/>
+          <w:iCs/>
+        </w:rPr>
         <w:t xml:space="preserve"> “Both spouses”</w:t>
       </w:r>
       <w:r>
@@ -1591,226 +1696,143 @@
           <w:numId w:val="1"/>
         </w:numPr>
       </w:pPr>
-      <w:proofErr w:type="gramStart"/>
       <w:r>
         <w:t xml:space="preserve">{{ </w:t>
       </w:r>
       <w:proofErr w:type="spellStart"/>
       <w:r>
-        <w:t>child.name</w:t>
-      </w:r>
-      <w:proofErr w:type="gramEnd"/>
+        <w:t>child.name.full</w:t>
+      </w:r>
+      <w:proofErr w:type="spellEnd"/>
+      <w:r>
+        <w:t>() }}</w:t>
+      </w:r>
+      <w:r>
+        <w:t xml:space="preserve">, </w:t>
+      </w:r>
+      <w:r>
+        <w:t xml:space="preserve">{% if </w:t>
+      </w:r>
+      <w:proofErr w:type="spellStart"/>
+      <w:r>
+        <w:t>child.</w:t>
+      </w:r>
+      <w:r>
+        <w:t>age_in_</w:t>
+      </w:r>
+      <w:r>
+        <w:t>months</w:t>
+      </w:r>
+      <w:proofErr w:type="spellEnd"/>
+      <w:r>
+        <w:t xml:space="preserve">() </w:t>
+      </w:r>
+      <w:r>
+        <w:t xml:space="preserve">&lt; 1 %}newborn.{% </w:t>
+      </w:r>
+      <w:proofErr w:type="spellStart"/>
+      <w:r>
+        <w:t>elif</w:t>
+      </w:r>
+      <w:proofErr w:type="spellEnd"/>
+      <w:r>
+        <w:t xml:space="preserve"> </w:t>
+      </w:r>
+      <w:proofErr w:type="spellStart"/>
+      <w:r>
+        <w:t>child.</w:t>
+      </w:r>
+      <w:r>
+        <w:t>age_in_</w:t>
+      </w:r>
+      <w:r>
+        <w:t>months</w:t>
+      </w:r>
+      <w:proofErr w:type="spellEnd"/>
+      <w:r>
+        <w:t>()</w:t>
+      </w:r>
+      <w:r>
+        <w:t xml:space="preserve"> == </w:t>
+      </w:r>
+      <w:r>
+        <w:t>1 %}</w:t>
+      </w:r>
+      <w:r>
+        <w:t xml:space="preserve">1 </w:t>
+      </w:r>
+      <w:r>
+        <w:t>month</w:t>
+      </w:r>
+      <w:r>
+        <w:t xml:space="preserve">.{% </w:t>
+      </w:r>
+      <w:proofErr w:type="spellStart"/>
+      <w:r>
+        <w:t>elif</w:t>
+      </w:r>
+      <w:proofErr w:type="spellEnd"/>
+      <w:r>
+        <w:t xml:space="preserve"> </w:t>
+      </w:r>
+      <w:proofErr w:type="spellStart"/>
+      <w:r>
+        <w:t>child.</w:t>
+      </w:r>
+      <w:r>
+        <w:t>age_in_years</w:t>
+      </w:r>
+      <w:proofErr w:type="spellEnd"/>
+      <w:r>
+        <w:t>()</w:t>
+      </w:r>
+      <w:r>
+        <w:t xml:space="preserve"> &lt; </w:t>
+      </w:r>
+      <w:proofErr w:type="gramStart"/>
+      <w:r>
+        <w:t>1 %}{{</w:t>
+      </w:r>
+      <w:proofErr w:type="gramEnd"/>
+      <w:r>
+        <w:t xml:space="preserve"> </w:t>
+      </w:r>
+      <w:proofErr w:type="spellStart"/>
+      <w:r>
+        <w:t>child.age_in_months</w:t>
+      </w:r>
+      <w:proofErr w:type="spellEnd"/>
+      <w:r>
+        <w:t>() }} months</w:t>
+      </w:r>
       <w:r>
         <w:t>.</w:t>
       </w:r>
-      <w:proofErr w:type="gramStart"/>
-      <w:r>
-        <w:t>full</w:t>
-      </w:r>
-      <w:proofErr w:type="spellEnd"/>
-      <w:r>
-        <w:t>() }</w:t>
-      </w:r>
-      <w:proofErr w:type="gramEnd"/>
-      <w:r>
-        <w:t>}</w:t>
-      </w:r>
-      <w:proofErr w:type="gramStart"/>
-      <w:r>
-        <w:t xml:space="preserve">, </w:t>
-      </w:r>
-      <w:r>
-        <w:t>{%</w:t>
-      </w:r>
-      <w:proofErr w:type="gramEnd"/>
-      <w:r>
-        <w:t xml:space="preserve"> if </w:t>
-      </w:r>
-      <w:proofErr w:type="spellStart"/>
-      <w:r>
-        <w:t>child.</w:t>
-      </w:r>
-      <w:r>
-        <w:t>age_in_</w:t>
-      </w:r>
-      <w:proofErr w:type="gramStart"/>
-      <w:r>
-        <w:t>months</w:t>
-      </w:r>
-      <w:proofErr w:type="spellEnd"/>
-      <w:r>
-        <w:t>(</w:t>
-      </w:r>
-      <w:proofErr w:type="gramEnd"/>
-      <w:r>
-        <w:t xml:space="preserve">) </w:t>
-      </w:r>
-      <w:r>
-        <w:t xml:space="preserve">&lt; 1 </w:t>
-      </w:r>
-      <w:proofErr w:type="gramStart"/>
-      <w:r>
-        <w:t>%}newborn.{</w:t>
-      </w:r>
-      <w:proofErr w:type="gramEnd"/>
-      <w:r>
-        <w:t xml:space="preserve">% </w:t>
-      </w:r>
-      <w:proofErr w:type="spellStart"/>
-      <w:r>
-        <w:t>elif</w:t>
-      </w:r>
-      <w:proofErr w:type="spellEnd"/>
-      <w:r>
-        <w:t xml:space="preserve"> </w:t>
-      </w:r>
-      <w:proofErr w:type="spellStart"/>
-      <w:r>
-        <w:t>child.</w:t>
-      </w:r>
-      <w:r>
-        <w:t>age_in_</w:t>
-      </w:r>
-      <w:proofErr w:type="gramStart"/>
-      <w:r>
-        <w:t>months</w:t>
-      </w:r>
-      <w:proofErr w:type="spellEnd"/>
-      <w:r>
-        <w:t>(</w:t>
-      </w:r>
-      <w:proofErr w:type="gramEnd"/>
-      <w:r>
-        <w:t>)</w:t>
-      </w:r>
-      <w:r>
-        <w:t xml:space="preserve"> == </w:t>
-      </w:r>
-      <w:proofErr w:type="gramStart"/>
-      <w:r>
-        <w:t>1 %}</w:t>
-      </w:r>
-      <w:proofErr w:type="gramEnd"/>
-      <w:r>
-        <w:t xml:space="preserve">1 </w:t>
-      </w:r>
-      <w:proofErr w:type="gramStart"/>
-      <w:r>
-        <w:t>month</w:t>
-      </w:r>
-      <w:r>
-        <w:t>.{</w:t>
-      </w:r>
-      <w:proofErr w:type="gramEnd"/>
-      <w:r>
-        <w:t xml:space="preserve">% </w:t>
-      </w:r>
-      <w:proofErr w:type="spellStart"/>
-      <w:r>
-        <w:t>elif</w:t>
-      </w:r>
-      <w:proofErr w:type="spellEnd"/>
-      <w:r>
-        <w:t xml:space="preserve"> </w:t>
-      </w:r>
-      <w:proofErr w:type="spellStart"/>
-      <w:r>
-        <w:t>child.</w:t>
-      </w:r>
-      <w:r>
-        <w:t>age_in_</w:t>
-      </w:r>
-      <w:proofErr w:type="gramStart"/>
-      <w:r>
-        <w:t>years</w:t>
-      </w:r>
-      <w:proofErr w:type="spellEnd"/>
-      <w:r>
-        <w:t>(</w:t>
-      </w:r>
-      <w:proofErr w:type="gramEnd"/>
-      <w:r>
-        <w:t>)</w:t>
-      </w:r>
-      <w:r>
-        <w:t xml:space="preserve"> &lt; </w:t>
-      </w:r>
-      <w:r>
-        <w:t xml:space="preserve">1 </w:t>
-      </w:r>
-      <w:proofErr w:type="gramStart"/>
-      <w:r>
-        <w:t xml:space="preserve">%}{{ </w:t>
-      </w:r>
-      <w:proofErr w:type="spellStart"/>
-      <w:r>
-        <w:t>child.age</w:t>
-      </w:r>
-      <w:proofErr w:type="gramEnd"/>
-      <w:r>
-        <w:t>_in_</w:t>
-      </w:r>
-      <w:proofErr w:type="gramStart"/>
-      <w:r>
-        <w:t>months</w:t>
-      </w:r>
-      <w:proofErr w:type="spellEnd"/>
-      <w:r>
-        <w:t>() }</w:t>
-      </w:r>
-      <w:proofErr w:type="gramEnd"/>
-      <w:r>
-        <w:t xml:space="preserve">} </w:t>
-      </w:r>
-      <w:proofErr w:type="gramStart"/>
-      <w:r>
-        <w:t>months</w:t>
+      <w:r>
+        <w:t xml:space="preserve">{% </w:t>
+      </w:r>
+      <w:proofErr w:type="gramStart"/>
+      <w:r>
+        <w:t>else %}{{</w:t>
+      </w:r>
+      <w:proofErr w:type="gramEnd"/>
+      <w:r>
+        <w:t xml:space="preserve"> </w:t>
+      </w:r>
+      <w:proofErr w:type="spellStart"/>
+      <w:r>
+        <w:t>child.age_in_years</w:t>
+      </w:r>
+      <w:proofErr w:type="spellEnd"/>
+      <w:r>
+        <w:t>() }}</w:t>
       </w:r>
       <w:r>
         <w:t>.</w:t>
       </w:r>
       <w:r>
-        <w:t>{</w:t>
-      </w:r>
-      <w:proofErr w:type="gramEnd"/>
-      <w:r>
-        <w:t xml:space="preserve">% else </w:t>
-      </w:r>
-      <w:proofErr w:type="gramStart"/>
-      <w:r>
-        <w:t xml:space="preserve">%}{{ </w:t>
-      </w:r>
-      <w:proofErr w:type="spellStart"/>
-      <w:r>
-        <w:t>child.age</w:t>
-      </w:r>
-      <w:proofErr w:type="gramEnd"/>
-      <w:r>
-        <w:t>_in_</w:t>
-      </w:r>
-      <w:proofErr w:type="gramStart"/>
-      <w:r>
-        <w:t>years</w:t>
-      </w:r>
-      <w:proofErr w:type="spellEnd"/>
-      <w:r>
-        <w:t>() }}</w:t>
-      </w:r>
-      <w:r>
-        <w:t>.</w:t>
-      </w:r>
-      <w:r>
-        <w:t>{</w:t>
-      </w:r>
-      <w:proofErr w:type="gramEnd"/>
-      <w:r>
-        <w:t xml:space="preserve">% </w:t>
-      </w:r>
-      <w:proofErr w:type="gramStart"/>
-      <w:r>
-        <w:t>endif %}</w:t>
-      </w:r>
-      <w:proofErr w:type="gramEnd"/>
+        <w:t>{% endif %}</w:t>
+      </w:r>
     </w:p>
     <w:p>
       <w:pPr>
@@ -1863,6 +1885,7 @@
         <w:ind w:left="720"/>
       </w:pPr>
       <w:r>
+        <w:lastRenderedPageBreak/>
         <w:t>{%</w:t>
       </w:r>
       <w:r>
@@ -1919,7 +1942,6 @@
         </w:numPr>
       </w:pPr>
       <w:r>
-        <w:lastRenderedPageBreak/>
         <w:t xml:space="preserve">I have read </w:t>
       </w:r>
       <w:proofErr w:type="gramStart"/>

</xml_diff>

<commit_message>
fix logic typo and standardize capitalization in testimony script
</commit_message>
<xml_diff>
--- a/docassemble/MLHDivorceAndCustody/data/templates/testimony_script.docx
+++ b/docassemble/MLHDivorceAndCustody/data/templates/testimony_script.docx
@@ -249,10 +249,16 @@
     </w:p>
     <w:p>
       <w:r>
-        <w:t>{%p else %}</w:t>
-      </w:r>
-      <w:r>
-        <w:br/>
+        <w:t xml:space="preserve">{%p </w:t>
+      </w:r>
+      <w:proofErr w:type="gramStart"/>
+      <w:r>
+        <w:t>else %}</w:t>
+      </w:r>
+      <w:proofErr w:type="gramEnd"/>
+    </w:p>
+    <w:p>
+      <w:r>
         <w:t xml:space="preserve">You only need this script if: </w:t>
       </w:r>
     </w:p>
@@ -265,7 +271,13 @@
         </w:numPr>
       </w:pPr>
       <w:r>
-        <w:t xml:space="preserve">you filed a counterclaim, </w:t>
+        <w:t xml:space="preserve">you filed a </w:t>
+      </w:r>
+      <w:r>
+        <w:t>C</w:t>
+      </w:r>
+      <w:r>
+        <w:t xml:space="preserve">ounterclaim, </w:t>
       </w:r>
     </w:p>
     <w:p>
@@ -825,7 +837,13 @@
         <w:t>% endif %}</w:t>
       </w:r>
       <w:r>
-        <w:t xml:space="preserve"> filed a complaint for divorce on</w:t>
+        <w:t xml:space="preserve"> filed a </w:t>
+      </w:r>
+      <w:r>
+        <w:t>C</w:t>
+      </w:r>
+      <w:r>
+        <w:t>omplaint for divorce on</w:t>
       </w:r>
       <w:r>
         <w:t xml:space="preserve"> </w:t>
@@ -2103,7 +2121,10 @@
         <w:t>%}</w:t>
       </w:r>
       <w:r>
-        <w:t>complaint</w:t>
+        <w:t>C</w:t>
+      </w:r>
+      <w:r>
+        <w:t>omplaint</w:t>
       </w:r>
       <w:proofErr w:type="gramEnd"/>
       <w:r>
@@ -2111,7 +2132,13 @@
       </w:r>
       <w:proofErr w:type="gramStart"/>
       <w:r>
-        <w:t>%}counterclaim</w:t>
+        <w:t>%}</w:t>
+      </w:r>
+      <w:r>
+        <w:t>C</w:t>
+      </w:r>
+      <w:r>
+        <w:t>ounterclaim</w:t>
       </w:r>
       <w:proofErr w:type="gramEnd"/>
       <w:r>
@@ -2148,7 +2175,10 @@
         <w:t>%}</w:t>
       </w:r>
       <w:r>
-        <w:t>complaint</w:t>
+        <w:t>C</w:t>
+      </w:r>
+      <w:r>
+        <w:t>omplaint</w:t>
       </w:r>
       <w:proofErr w:type="gramEnd"/>
       <w:r>
@@ -2156,7 +2186,13 @@
       </w:r>
       <w:proofErr w:type="gramStart"/>
       <w:r>
-        <w:t>%}counterclaim</w:t>
+        <w:t>%}</w:t>
+      </w:r>
+      <w:r>
+        <w:t>C</w:t>
+      </w:r>
+      <w:r>
+        <w:t>ounterclaim</w:t>
       </w:r>
       <w:proofErr w:type="gramEnd"/>
       <w:r>

</xml_diff>